<commit_message>
implemented input from Elena
</commit_message>
<xml_diff>
--- a/example_articles/countries/Argentina/1.countries_Argentina_New_York_Times.docx
+++ b/example_articles/countries/Argentina/1.countries_Argentina_New_York_Times.docx
@@ -7,7 +7,9 @@
         <w:pStyle w:val="Heading1"/>
       </w:pPr>
       <w:r>
-        <w:t>Nostalgia Shaped Some Teamster Votes</w:t>
+        <w:t>FILM FESTIVAL REVIEWS;</w:t>
+        <w:br/>
+        <w:t>An Unemployed Guy Who Won't Follow Doctor's Orders</w:t>
       </w:r>
     </w:p>
     <w:p>
@@ -17,17 +19,17 @@
     </w:p>
     <w:p>
       <w:r>
-        <w:t>Date: 1996-12-18</w:t>
+        <w:t>Date: 2000-04-03</w:t>
       </w:r>
     </w:p>
     <w:p>
       <w:r>
-        <w:t>Section: Section A; ; Section A; Page 24; Column 4; National Desk ; Column 4;</w:t>
+        <w:t>Section: Section E; ; Section E; Page 5; Column 2; The Arts/Cultural Desk ; Column 2; ; Review</w:t>
       </w:r>
     </w:p>
     <w:p>
       <w:r>
-        <w:t>Source file: NYT/41.DOCX</w:t>
+        <w:t>Source file: NYT/38.DOCX</w:t>
       </w:r>
     </w:p>
     <w:p>
@@ -49,49 +51,36 @@
     </w:p>
     <w:p>
       <w:r>
-        <w:t>A generation ago, when this city roared as a blue-collar powerhouse, when unions were still winning fat contracts and picket lines were still dangerous to cross, nobody stood tougher than Jimmy Hoffa and his teamsters.</w:t>
+        <w:t>Rulo (Luis Margani), the indefatigably persevering central character of Pablo Trapero's powerfully gritty film "Crane World," is a divorced, unemployed 49-year-old day laborer in Buenos Aires who is desperate for whatever work he can scrounge up. Most of his job opportunities come through his best friend, Torres (Daniel Valenzuela), who has connections in the Argentine construction industry.</w:t>
         <w:br/>
-        <w:t>For union men and women, that sort of paradise has been lost for years. High-paying factory jobs have disappeared by the millions. Union membership has hemorrhaged. Any teamster pulling into a truck stop today will almost surely be vastly outnumbered by nonunion drivers.</w:t>
+        <w:t>When Torres recommends him for a job as a crane operator, Rulo doesn't blink twice, even though he has never operated one before. When the two men visit the building site, Torres coaxes the overweight, beer-bellied Rulo out on a scaffold and re-assures him that he'll quickly conquer any fear of heights. A confident mechanic who finds the secrets of machines readily decipherable, Rulo is eager to get started as soon as possible.</w:t>
         <w:br/>
-        <w:t>Plenty of teamsters say it is time to go back to the old days. That explains, at least in part, the strong showing by James P. Hoffa, son of the legendary leader of the International Brotherhood of Teamsters, in the union's recent election.</w:t>
+        <w:t>In its utter plainness "Crane World," which New Directors/New Films is screening at the Museum of Modern Art tonight at 8:30 and tomorrow night at 6 before it opens on Friday at the Screening Room, is a stylistic throwback to 1940's Italian neo-realism. The movie's grainy, sepia-toned cinematography and low-key naturalistic performances by a cast of nonprofessionals enhance its slice-of-life authenticity. Rather than tell a story, "Crane World" immerses us in the world of Rulo, his family (he is supporting a mother and a layabout son) and co-workers.</w:t>
         <w:br/>
-        <w:t>"From what you hear, teamsters had it better when Jimmy Hoffa was around," said David Krueger, a 27-year-old United Parcel Service driver, slamming his door shut at a big truck stop west of Detroit, as a wet snowfall was making roads slick. "We were strong."</w:t>
+        <w:t>Before starting work Rulo must have a physical checkup. During the examination the doctor advises Rulo to lose 40 or 50 pounds and to cut down on cigarettes and beer. Rulo forgets the warning until he arrives for his first day on the job and discovers another man running the crane. The boss curtly informs him that he was rejected by the insurance company for being overweight. Rulo is infuriated, but his anger quickly fades into resignation. That's just the way it goes in the world of semiskilled labor.</w:t>
         <w:br/>
-        <w:t>Whether it was the magic of the Hoffa name, or simply an expression of frustration among the rank and file, the election was a close call for the incumbent president, Ron Carey.</w:t>
+        <w:t>Without making a moral or political fuss about it and without sentimentalizing Rulo and his friends as downtrodden heroes, "Crane World" paints a blunt eye-level vision of the realities of Argentine working-class life. Unlike workers in the wealthier, more socially fluid United States where the spectacle of overnight millionaires puts everyone on edge, Rulo and his friends appear completely settled in their class and comfortable with who they are.</w:t>
         <w:br/>
-        <w:t>Mr. Carey, who assumed the office five years ago pledging a cleaner union, won re-election 52 percent to 48 percent. But here in Michigan, and in most of the Midwest, Mr. Hoffa led the voting.</w:t>
+        <w:t>Twenty years earlier, we learn, Rulo had a momentary fling at celebrity as a member a rock band that proved to be a one-hit wonder. But although proud of his glory days, Rulo feels no bitterness. Now his 19-year-old son Claudio (Federico Esquerro) is a member of a struggling rockabilly band. When the father and son get on each other's nerves, Rulo sends Claudio to live with his mother (Graciana Chironi).</w:t>
         <w:br/>
-        <w:t>Some of Mr. Hoffa's supporters have raised questions about the balloting. About 40,000 ballots were put aside by election judges, usually because of questions about eligibility.</w:t>
+        <w:t>Rulo also strikes up a relationship with Adriana (Adriana Aizemberg), an exuberant middle-aged woman who owns a local kiosk. Just as their romance is gathering steam, Rulo lands a job operating an excavating machine in distant Patagonia. Here the workers live dormitory style in a remote farmhouse, and the relationship between management and labor is tenuous. One day when the workers are not given lunch, they simply refuse to continue until they are fed.</w:t>
         <w:br/>
-        <w:t>Nancy Stella, a spokeswoman for the teamsters, said an election officer was sifting through the challenged ballots to see which ones should be counted. But it was not expected to change the outcome.</w:t>
+        <w:t>"Crane World" offers a bedrock vision of humanity making do. The social outlook of Rulo and his friends couldn't even be described as of one of lowered expectations. What keeps them going is an instinctual optimism, a rough-hewn camaraderie and an elemental faith in themselves and in the world to meet their needs and give them enough to indulge in a few simple pleasures.</w:t>
         <w:br/>
-        <w:t>"The assumption is that these votes will break in roughly the same proportion" as the overall count, Ms. Stella said.</w:t>
+        <w:t xml:space="preserve"> </w:t>
         <w:br/>
-        <w:t>Mr. Krueger, a suburban Detroit resident who voted for Mr. Hoffa, has no memory of the old teamster leader, who disappeared in 1975 -- murdered, conventional wisdom has it, by mobsters.</w:t>
+        <w:t>CRANE WORLD</w:t>
         <w:br/>
-        <w:t>Local 299, once the power base for Jimmy Hoffa, sits down the road from Tiger Stadium in a neighborhood pockmarked with burned-out buildings and boarded-up stores.</w:t>
+        <w:t xml:space="preserve"> </w:t>
         <w:br/>
-        <w:t>The local had been ripped by violence in the year before Hoffa disappeared. The cabin cruiser of the local's president was blown up, one of several incidents of intimidation.</w:t>
+        <w:t>Written, produced and directed by Pablo Trapero; in Spanish, with English subtitles; director of photography, Cobi Migliora; edited by Nicolas Goldbart; art director, Andres Tambornino; released by Cowboy Booking International. Running time: 90 minutes. This film is not rated. Shown with a 15-minute short, Josue Mendez's "Parelisa," tonight at 8:30 and Tuesday night at 6 at the Roy and Niuta Titus Theater, Museum of Modern Art, 11 West 53rd Street, Manhattan, as part of the 29th New Directors/New Films series of the Film Society of Lincoln Center and the department of Film of The Museum of Modern Art. It will open on Friday at the Screening Room, 54 Varick Street, at Laight Street, TriBeCa.</w:t>
         <w:br/>
-        <w:t>The local backed Mr. Carey in the election. Edward Vecchio, the secretary-treasurer of the local, said Mr. Carey had been supported by the local leadership simply "because he was the best man."</w:t>
+        <w:t xml:space="preserve"> </w:t>
         <w:br/>
-        <w:t>The teamsters union, which now includes many members who are not truck drivers, like teachers and nurses, is the nation's largest union in the private sector, with about 1.4 million members. But membership has been dropping for years.</w:t>
+        <w:t>WITH: Luis Margani (Rulo), Adriana Aizemberg (Adriana), Daniel Valenzuela (Torres), Roly Serrano (Walter), Federico Esquerro (Claudio), Graciana Chironi (Rulo's mother) and Alfonso Rementeria (Sartori).</w:t>
         <w:br/>
-        <w:t>When Mr. Hoffa, a lawyer, campaigned, he bristled at questions about the corruption involving his father, who served prison time, and focused on the strength of the union during Jimmy Hoffa's tenure.</w:t>
         <w:br/>
-        <w:t>Opponents of James Hoffa said his election could mean a return to corruption, but his supporters saw it another way. Some said it was unfair to impugn the son's character for the deeds of the father.</w:t>
-        <w:br/>
-        <w:t>Indeed, some cited questions about conflict of interest involving Mr. Carey after it was disclosed that his father held stock in the United Parcel Service worth about $2 million.</w:t>
-        <w:br/>
-        <w:t>Others said they did not much care about corruption. "As long as they don't steal from me, I don't care," said Mike LaMonica, 32, a truck driver from Waukegan, Ill.</w:t>
-        <w:br/>
-        <w:t>But Mike Slocum, 52, a truck driver from the Detroit area, said it was a mistake to assume that Hoffa the son could be as strong as his father.</w:t>
-        <w:br/>
-        <w:t>He also questioned James Hoffa's depth of commitment to the working class, noting that he drove a truck for only a brief period before getting his law degree. Jimmy Hoffa, in contrast, was a ninth-grade dropout who used to say that nobody ever got anything without a fight.</w:t>
-        <w:br/>
-        <w:t>"When the old man said, 'This is the way it's going to be,' that was the way it was going to be," Mr. Slocum said with a chuckle. "When he called a strike, everybody went on strike. But it's a different world out there today."</w:t>
-        <w:br/>
-        <w:t>He added: "It used to be, if you didn't get your way, you busted heads and destroyed machines. You just can't do that today. And some of the guys, when they get frustrated, start thinking, 'Maybe we ought to go back to the head-busting ways.' But you just can't."</w:t>
+        <w:t>http://www.nytimes.com</w:t>
         <w:br/>
         <w:br/>
         <w:t>Graphic</w:t>
@@ -99,7 +88,7 @@
         <w:br/>
         <w:t xml:space="preserve"> </w:t>
         <w:br/>
-        <w:t>Photo: For truck drivers like David Krueger, left, and Mike LaMonica, the days of a tough teamsters' union, once led by the legendary Jimmy Hoffa, are long over. Hoffa's son, James, recently lost his bid for union president. (Peter Yates for The New York Times)</w:t>
+        <w:t>Photo: Luis Margani and his semiskilled mates take life as it comes in the film "Crane World." (Film Society of Lincoln Center)</w:t>
       </w:r>
     </w:p>
     <w:sectPr>

</xml_diff>